<commit_message>
The Dragon Boat Festival
</commit_message>
<xml_diff>
--- a/readme.docx
+++ b/readme.docx
@@ -20,6 +20,21 @@
     <w:p>
       <w:pPr>
         <w:rPr>
+          <w:rFonts w:hint="eastAsia"/>
+          <w:lang w:val="en-US" w:eastAsia="zh-CN"/>
+        </w:rPr>
+      </w:pPr>
+      <w:r>
+        <w:rPr>
+          <w:rFonts w:hint="eastAsia"/>
+          <w:lang w:val="en-US" w:eastAsia="zh-CN"/>
+        </w:rPr>
+        <w:t>2023年6月2日星期四</w:t>
+      </w:r>
+    </w:p>
+    <w:p>
+      <w:pPr>
+        <w:rPr>
           <w:rFonts w:hint="default"/>
           <w:lang w:val="en-US" w:eastAsia="zh-CN"/>
         </w:rPr>
@@ -29,7 +44,7 @@
           <w:rFonts w:hint="eastAsia"/>
           <w:lang w:val="en-US" w:eastAsia="zh-CN"/>
         </w:rPr>
-        <w:t>2023年6月2日星期四</w:t>
+        <w:t>2024年端午节</w:t>
       </w:r>
       <w:bookmarkStart w:id="0" w:name="_GoBack"/>
       <w:bookmarkEnd w:id="0"/>

</xml_diff>

<commit_message>
add simple and facile
</commit_message>
<xml_diff>
--- a/readme.docx
+++ b/readme.docx
@@ -104,33 +104,26 @@
           <w:rFonts w:hint="eastAsia"/>
           <w:lang w:val="en-US" w:eastAsia="zh-CN"/>
         </w:rPr>
-        <w:t>多云转小雨，今天学习了分支管理，创建了一个dev分支，</w:t>
+        <w:t>多云转小雨，今天学习了分支管理，创建了一个dev分支，使用Git创建分支简单又便捷。</w:t>
       </w:r>
+    </w:p>
+    <w:p>
+      <w:pPr>
+        <w:rPr>
+          <w:rFonts w:hint="default"/>
+          <w:lang w:val="en-US" w:eastAsia="zh-CN"/>
+        </w:rPr>
+      </w:pPr>
+    </w:p>
+    <w:p>
+      <w:pPr>
+        <w:rPr>
+          <w:rFonts w:hint="default"/>
+          <w:lang w:val="en-US" w:eastAsia="zh-CN"/>
+        </w:rPr>
+      </w:pPr>
       <w:bookmarkStart w:id="0" w:name="_GoBack"/>
       <w:bookmarkEnd w:id="0"/>
-      <w:r>
-        <w:rPr>
-          <w:rFonts w:hint="eastAsia"/>
-          <w:lang w:val="en-US" w:eastAsia="zh-CN"/>
-        </w:rPr>
-        <w:t>使用Git创建分支简单又快速。</w:t>
-      </w:r>
-    </w:p>
-    <w:p>
-      <w:pPr>
-        <w:rPr>
-          <w:rFonts w:hint="default"/>
-          <w:lang w:val="en-US" w:eastAsia="zh-CN"/>
-        </w:rPr>
-      </w:pPr>
-    </w:p>
-    <w:p>
-      <w:pPr>
-        <w:rPr>
-          <w:rFonts w:hint="default"/>
-          <w:lang w:val="en-US" w:eastAsia="zh-CN"/>
-        </w:rPr>
-      </w:pPr>
     </w:p>
     <w:sectPr>
       <w:pgSz w:w="11906" w:h="16838"/>

</xml_diff>